<commit_message>
feat(pack): finalisation des livrables IGPDE
</commit_message>
<xml_diff>
--- a/livrables-IGPDE-2026-102846/Livrables-Formateur/documents-administratifs-igpde/102846FiTechn-v2.docx
+++ b/livrables-IGPDE-2026-102846/Livrables-Formateur/documents-administratifs-igpde/102846FiTechn-v2.docx
@@ -368,7 +368,7 @@
       </w:pPr>
       <w:r>
         <w:rPr/>
-        <w:t>Droits suffisants pour ouvrir, installer ou mettre à jour les outils nécessaires avant la session.</w:t>
+        <w:t>Autorisation d’exécuter les logiciels portables et d’ajouter les extensions nécessaires dans les navigateurs avant la session, selon la politique de la DSI.</w:t>
       </w:r>
     </w:p>
     <w:p>
@@ -424,7 +424,7 @@
       </w:pPr>
       <w:r>
         <w:rPr/>
-        <w:t>Accès aux dossiers d’exercices, au support de formation et au site Easy Checks.</w:t>
+        <w:t>Accès aux dossiers d’exercices, aux six présentations du dossier supports-projections et au site Easy Checks.</w:t>
       </w:r>
     </w:p>
     <w:p>
@@ -654,7 +654,7 @@
       </w:pPr>
       <w:r>
         <w:rPr/>
-        <w:t>PDF Accessibility Checker 2024 installé sur chaque poste, formateur et stagiaires, pour le contrôle du PDF.</w:t>
+        <w:t>PAC 24.4.4.0 portable disponible sur les postes pour contrôler le PDF ; .NET Framework 4.8 ou supérieur est requis.</w:t>
       </w:r>
     </w:p>
     <w:p>
@@ -682,7 +682,7 @@
       </w:pPr>
       <w:r>
         <w:rPr/>
-        <w:t xml:space="preserve">Un outil de contrôle de contraste, par exemple </w:t>
+        <w:t xml:space="preserve">Version portable 3.5.5 de </w:t>
       </w:r>
       <w:hyperlink r:id="rId2">
         <w:r>
@@ -694,7 +694,7 @@
       </w:hyperlink>
       <w:r>
         <w:rPr/>
-        <w:t>.</w:t>
+        <w:t xml:space="preserve"> pour mesurer les contrastes.</w:t>
       </w:r>
     </w:p>
     <w:p>
@@ -728,21 +728,21 @@
       </w:hyperlink>
       <w:r>
         <w:rPr/>
-        <w:t xml:space="preserve"> installé sur chaque poste, formateur et stagiaires.</w:t>
-      </w:r>
-    </w:p>
-    <w:p>
-      <w:pPr>
-        <w:pStyle w:val="Compact"/>
-        <w:numPr>
-          <w:ilvl w:val="0"/>
-          <w:numId w:val="1"/>
-        </w:numPr>
-        <w:rPr/>
-      </w:pPr>
-      <w:r>
-        <w:rPr/>
-        <w:t xml:space="preserve">Extension </w:t>
+        <w:t xml:space="preserve"> 2026.2 en copie portable disponible sur les postes formateur et stagiaires.</w:t>
+      </w:r>
+    </w:p>
+    <w:p>
+      <w:pPr>
+        <w:pStyle w:val="Compact"/>
+        <w:numPr>
+          <w:ilvl w:val="0"/>
+          <w:numId w:val="1"/>
+        </w:numPr>
+        <w:rPr/>
+      </w:pPr>
+      <w:r>
+        <w:rPr/>
+        <w:t xml:space="preserve">Complément </w:t>
       </w:r>
       <w:hyperlink r:id="rId4">
         <w:r>
@@ -754,7 +754,7 @@
       </w:hyperlink>
       <w:r>
         <w:rPr/>
-        <w:t xml:space="preserve"> si NonVisual Desktop Access est utilisé en démonstration.</w:t>
+        <w:t xml:space="preserve"> 6.6 facultatif : compatibilité avec NVDA 2026.2 à vérifier sur un poste avant tout déploiement.</w:t>
       </w:r>
     </w:p>
     <w:p>
@@ -826,7 +826,7 @@
         <w:rPr>
           <w:lang w:val="en-US"/>
         </w:rPr>
-        <w:t xml:space="preserve">Extensions Firefox utiles : </w:t>
+        <w:t xml:space="preserve">Extensions Firefox à préparer selon le guide du pack, dont </w:t>
       </w:r>
       <w:hyperlink r:id="rId5">
         <w:r>
@@ -871,21 +871,21 @@
         <w:rPr>
           <w:lang w:val="en-US"/>
         </w:rPr>
-        <w:t>.</w:t>
-      </w:r>
-    </w:p>
-    <w:p>
-      <w:pPr>
-        <w:pStyle w:val="Compact"/>
-        <w:numPr>
-          <w:ilvl w:val="0"/>
-          <w:numId w:val="1"/>
-        </w:numPr>
-        <w:rPr/>
-      </w:pPr>
-      <w:r>
-        <w:rPr/>
-        <w:t xml:space="preserve">Extension ou service de test web complémentaire : </w:t>
+        <w:t xml:space="preserve"> ; prévoir aussi les extensions Edge nécessaires aux démonstrations.</w:t>
+      </w:r>
+    </w:p>
+    <w:p>
+      <w:pPr>
+        <w:pStyle w:val="Compact"/>
+        <w:numPr>
+          <w:ilvl w:val="0"/>
+          <w:numId w:val="1"/>
+        </w:numPr>
+        <w:rPr/>
+      </w:pPr>
+      <w:r>
+        <w:rPr/>
+        <w:t xml:space="preserve">Extension Edge complémentaire : </w:t>
       </w:r>
       <w:hyperlink r:id="rId8">
         <w:r>
@@ -897,7 +897,7 @@
       </w:hyperlink>
       <w:r>
         <w:rPr/>
-        <w:t>.</w:t>
+        <w:t xml:space="preserve"> Accessibility Checker.</w:t>
       </w:r>
     </w:p>
     <w:p>
@@ -953,15 +953,16 @@
     <w:p>
       <w:pPr>
         <w:pStyle w:val="Compact"/>
-        <w:numPr>
-          <w:ilvl w:val="0"/>
-          <w:numId w:val="1"/>
-        </w:numPr>
-        <w:rPr/>
-      </w:pPr>
-      <w:r>
-        <w:rPr/>
-        <w:t xml:space="preserve">Support PowerPoint principal </w:t>
+        <w:keepNext/>
+        <w:numPr>
+          <w:ilvl w:val="0"/>
+          <w:numId w:val="1"/>
+        </w:numPr>
+        <w:rPr/>
+      </w:pPr>
+      <w:r>
+        <w:rPr/>
+        <w:t xml:space="preserve">Support officiel IGPDE : </w:t>
       </w:r>
       <w:r>
         <w:rPr>
@@ -972,6 +973,19 @@
       <w:r>
         <w:rPr/>
         <w:t>.</w:t>
+      </w:r>
+    </w:p>
+    <w:p>
+      <w:pPr>
+        <w:pStyle w:val="Compact"/>
+        <w:keepLines/>
+        <w:numPr>
+          <w:ilvl w:val="0"/>
+          <w:numId w:val="1"/>
+        </w:numPr>
+      </w:pPr>
+      <w:r>
+        <w:t>Présentations projetées du dossier supports-projections : 00-introduction-et-idees-recues.pptx ; 01-accessibilite-numerique-et-cadre-legal.pptx ; 02-documents-bureautiques-accessibles-tp.pptx ; 03-web-accessible-tp.pptx ; 04-reseaux-sociaux-accessibles.pptx.</w:t>
       </w:r>
     </w:p>
     <w:p>
@@ -1075,7 +1089,7 @@
       </w:pPr>
       <w:r>
         <w:rPr/>
-        <w:t>Fichier de ressources et liens utiles : fiche des liens des TP en ligne (liens-tp-en-ligne.pdf).</w:t>
+        <w:t>Fiche des liens pour les stagiaires : Livrables-Stagiaires/liens-pour-les-stagiaires.pdf.</w:t>
       </w:r>
     </w:p>
     <w:p>
@@ -1103,7 +1117,7 @@
       </w:pPr>
       <w:r>
         <w:rPr/>
-        <w:t>Fiche formateur et fiche stagiaire sur les principes WCAG (PDF).</w:t>
+        <w:t>Fiche stagiaire sur les principes WCAG (PDF).</w:t>
       </w:r>
     </w:p>
     <w:p>
@@ -1247,7 +1261,7 @@
       </w:pPr>
       <w:r>
         <w:rPr/>
-        <w:t>Fiche des liens des TP en ligne (PDF).</w:t>
+        <w:t>Fiche liens-pour-les-stagiaires.pdf, avec les cinq présentations projetées et les ressources en ligne.</w:t>
       </w:r>
     </w:p>
     <w:p>
@@ -2130,7 +2144,7 @@
                 <w:szCs w:val="24"/>
                 <w:lang w:val="fr-FR" w:eastAsia="zh-CN" w:bidi="ar-SA"/>
               </w:rPr>
-              <w:t>Outil web ou installation locale selon le contexte.</w:t>
+              <w:t>Application Windows portable 3.5.5, à préparer avant la session.</w:t>
             </w:r>
           </w:p>
         </w:tc>
@@ -2228,7 +2242,7 @@
                 <w:szCs w:val="24"/>
                 <w:lang w:val="fr-FR" w:eastAsia="zh-CN" w:bidi="ar-SA"/>
               </w:rPr>
-              <w:t>À préparer avant la session si les droits sont limités.</w:t>
+              <w:t>Installer depuis le catalogue ou les fichiers XPI du pack, selon la politique de la DSI.</w:t>
             </w:r>
           </w:p>
         </w:tc>
@@ -2323,7 +2337,7 @@
                 <w:szCs w:val="24"/>
                 <w:lang w:val="fr-FR" w:eastAsia="zh-CN" w:bidi="ar-SA"/>
               </w:rPr>
-              <w:t>Edge accepte les extensions de cette boutique. À préparer avant la session si les droits sont limités.</w:t>
+              <w:t>Edge peut demander l’autorisation des extensions d’un autre magasin ; voir aussi Edge Add-ons et le guide du pack.</w:t>
             </w:r>
           </w:p>
         </w:tc>
@@ -2902,7 +2916,7 @@
                 <w:szCs w:val="24"/>
                 <w:lang w:val="fr-FR" w:eastAsia="zh-CN" w:bidi="ar-SA"/>
               </w:rPr>
-              <w:t>Extension de navigateur à installer avant la session si les droits sont limités. Domaine à autoriser : silktide.com.</w:t>
+              <w:t>Extension Edge à préparer avant la session selon la politique de la DSI ; voir le guide du pack.</w:t>
             </w:r>
           </w:p>
         </w:tc>
@@ -3028,7 +3042,7 @@
       </w:pPr>
       <w:r>
         <w:rPr/>
-        <w:t>Tester l’ouverture du support PowerPoint sur le poste formateur.</w:t>
+        <w:t>Tester l’ouverture du support officiel et des cinq présentations projetées sur le poste formateur, ainsi que leurs notes.</w:t>
       </w:r>
     </w:p>
     <w:p>
@@ -3084,7 +3098,7 @@
       </w:pPr>
       <w:r>
         <w:rPr/>
-        <w:t>Tester au moins un outil de contraste et une extension de titres dans le navigateur.</w:t>
+        <w:t>Tester CCA portable et les extensions de titres dans Edge et Firefox sur un poste représentatif.</w:t>
       </w:r>
     </w:p>
     <w:p>
@@ -3112,7 +3126,7 @@
       </w:pPr>
       <w:r>
         <w:rPr/>
-        <w:t>Installer sur chaque poste, formateur et stagiaires, les outils fournis dans le dossier partagé (dossier outils du pack) : NVDA 2024.4.1 et son extension Focus Highlight 6.6, Colour Contrast Analyser 3.5.4 et PDF Accessibility Checker 2024 (PAC 24.3.1.0). Vérifier la disponibilité d’Acrobat Pro en solution de remplacement.</w:t>
+        <w:t>Préparer le dossier outils avec make outils-telecharger depuis l’usine, puis contrôler les 29 fichiers avec make outils. Les liens officiels, les versions, les empreintes et les limites d’installation figurent dans outils/LIENS-INSTALLATION.md. Prévoir NVDA 2026.2 en copie portable, CCA portable 3.5.5 et PAC portable 24.4.4.0 sur les postes. Préparer les extensions Firefox et Edge selon la politique de la DSI. Ne diffuser Focus Highlight 6.6 qu’après un essai concluant avec NVDA 2026.2. Acrobat Pro reste une solution de remplacement pour le contrôle PDF.</w:t>
       </w:r>
     </w:p>
     <w:p>

</xml_diff>